<commit_message>
Remove comments, highlights, and pre-lab explanations from Lab 3 report
Co-Authored-By: Claude Sonnet 4.6 <noreply@anthropic.com>
</commit_message>
<xml_diff>
--- a/Labs/Lab 3/ECE332_Lab3_Waveguides_Official.docx
+++ b/Labs/Lab 3/ECE332_Lab3_Waveguides_Official.docx
@@ -122,9 +122,7 @@
           <w:id w:val="1209847925"/>
           <w:tag w:val="goog_rdk_0"/>
         </w:sdtPr>
-        <w:sdtContent>
-          <w:commentRangeStart w:id="0"/>
-        </w:sdtContent>
+        <w:sdtContent/>
       </w:sdt>
       <w:r>
         <w:rPr>
@@ -184,25 +182,6 @@
     </w:p>
     <w:p>
       <w:pPr>
-        <w:spacing w:after="80" w:lineRule="auto"/>
-        <w:rPr/>
-      </w:pPr>
-      <w:r>
-        <w:rPr>
-          <w:sz w:val="22"/>
-          <w:szCs w:val="22"/>
-          <w:rtl w:val="0"/>
-        </w:rPr>
-        <w:t xml:space="preserve">TEM waves require two distinct conductors so the transverse electric field can terminate on separated charges. A rectangular waveguide has only one conductor (the metallic pipe), so there is no return path for transverse current — TEM cannot exist. Only TE and TM modes propagate inside. Optical fibers guide light by total internal reflection between dielectric layers; with no conducting boundaries to enforce TEM boundary conditions, they support hybrid HE/EH modes, not TEM. Coaxial cables and parallel-plate lines both have two conductors and do support TEM propagation.</w:t>
-      </w:r>
-      <w:r>
-        <w:rPr>
-          <w:rtl w:val="0"/>
-        </w:rPr>
-      </w:r>
-    </w:p>
-    <w:p>
-      <w:pPr>
         <w:spacing w:after="40" w:before="160" w:lineRule="auto"/>
         <w:rPr/>
       </w:pPr>
@@ -243,25 +222,6 @@
     </w:p>
     <w:p>
       <w:pPr>
-        <w:spacing w:after="80" w:lineRule="auto"/>
-        <w:rPr/>
-      </w:pPr>
-      <w:r>
-        <w:rPr>
-          <w:sz w:val="22"/>
-          <w:szCs w:val="22"/>
-          <w:rtl w:val="0"/>
-        </w:rPr>
-        <w:t xml:space="preserve">For TM modes in a rectangular waveguide the boundary condition Ez = 0 on all four walls requires both mode indices m ≥ 1 and n ≥ 1 (a zero index forces the entire field to vanish). Therefore TM₀₀, TM₁₀, and TM₀₁ do not physically exist. The lowest-order TM mode that satisfies the boundary conditions is TM₁₁, making it the dominant TM mode.</w:t>
-      </w:r>
-      <w:r>
-        <w:rPr>
-          <w:rtl w:val="0"/>
-        </w:rPr>
-      </w:r>
-    </w:p>
-    <w:p>
-      <w:pPr>
         <w:spacing w:after="40" w:before="160" w:lineRule="auto"/>
         <w:rPr/>
       </w:pPr>
@@ -302,25 +262,6 @@
     </w:p>
     <w:p>
       <w:pPr>
-        <w:spacing w:after="80" w:lineRule="auto"/>
-        <w:rPr/>
-      </w:pPr>
-      <w:r>
-        <w:rPr>
-          <w:sz w:val="22"/>
-          <w:szCs w:val="22"/>
-          <w:rtl w:val="0"/>
-        </w:rPr>
-        <w:t xml:space="preserve">For TE modes, Hz ≠ 0 and either index may be zero (but not both simultaneously). The cutoff frequency is f_c = (c/2)√((m/a)² + (n/b)²). For a waveguide with a &gt; b, the smallest cutoff occurs when m = 1, n = 0, giving f_c(TE₁₀) = c/(2a). This is lower than all other TE or TM modes, so TE₁₀ is the dominant (lowest-frequency) mode of a rectangular waveguide.</w:t>
-      </w:r>
-      <w:r>
-        <w:rPr>
-          <w:rtl w:val="0"/>
-        </w:rPr>
-      </w:r>
-    </w:p>
-    <w:p>
-      <w:pPr>
         <w:spacing w:after="40" w:before="160" w:lineRule="auto"/>
         <w:rPr/>
       </w:pPr>
@@ -361,25 +302,6 @@
     </w:p>
     <w:p>
       <w:pPr>
-        <w:spacing w:after="80" w:lineRule="auto"/>
-        <w:rPr/>
-      </w:pPr>
-      <w:r>
-        <w:rPr>
-          <w:sz w:val="22"/>
-          <w:szCs w:val="22"/>
-          <w:rtl w:val="0"/>
-        </w:rPr>
-        <w:t xml:space="preserve">A resonant cavity has a specific resonant frequency determined by its geometry. It strongly absorbs (or transmits, depending on coupling) only signals near that resonant frequency, attenuating all others. In Experiment 3.2, when the cavity resonates the SWR meter reading drops sharply — the cavity "notches out" energy at one narrow frequency, which is the signature of bandpass behavior. From the perspective of what frequencies are passed to the load, the cavity acts as a bandpass filter.</w:t>
-      </w:r>
-      <w:r>
-        <w:rPr>
-          <w:rtl w:val="0"/>
-        </w:rPr>
-      </w:r>
-    </w:p>
-    <w:p>
-      <w:pPr>
         <w:spacing w:after="40" w:before="160" w:lineRule="auto"/>
         <w:rPr/>
       </w:pPr>
@@ -411,29 +333,6 @@
           <w:rtl w:val="0"/>
         </w:rPr>
         <w:t xml:space="preserve">Answer: (b) Hewlett Packard 415E</w:t>
-      </w:r>
-      <w:r>
-        <w:rPr>
-          <w:rtl w:val="0"/>
-        </w:rPr>
-      </w:r>
-    </w:p>
-    <w:p>
-      <w:pPr>
-        <w:spacing w:after="80" w:lineRule="auto"/>
-        <w:rPr/>
-      </w:pPr>
-      <w:r>
-        <w:rPr>
-          <w:sz w:val="22"/>
-          <w:szCs w:val="22"/>
-          <w:rtl w:val="0"/>
-        </w:rPr>
-        <w:t xml:space="preserve">The HP 415E is the SWR Meter — a high-gain amplifier tuned to 1 kHz that reads the modulated microwave signal detected by the probe. The Systron/Donner 5000 is the sweeper/oscillator (microwave signal source), not a measurement instrument.</w:t>
-      </w:r>
-      <w:commentRangeEnd w:id="0"/>
-      <w:r>
-        <w:commentReference w:id="0"/>
       </w:r>
       <w:r>
         <w:rPr>
@@ -6252,69 +6151,11 @@
 </file>
 
 <file path=word/comments.xml><?xml version="1.0" encoding="utf-8"?>
-<w:comments xmlns:mc="http://schemas.openxmlformats.org/markup-compatibility/2006" xmlns:o="urn:schemas-microsoft-com:office:office" xmlns:r="http://schemas.openxmlformats.org/officeDocument/2006/relationships" xmlns:m="http://schemas.openxmlformats.org/officeDocument/2006/math" xmlns:v="urn:schemas-microsoft-com:vml" xmlns:wp="http://schemas.openxmlformats.org/drawingml/2006/wordprocessingDrawing" xmlns:w10="urn:schemas-microsoft-com:office:word" xmlns:w="http://schemas.openxmlformats.org/wordprocessingml/2006/main" xmlns:wne="http://schemas.microsoft.com/office/word/2006/wordml" xmlns:sl="http://schemas.openxmlformats.org/schemaLibrary/2006/main" xmlns:a="http://schemas.openxmlformats.org/drawingml/2006/main" xmlns:pic="http://schemas.openxmlformats.org/drawingml/2006/picture" xmlns:c="http://schemas.openxmlformats.org/drawingml/2006/chart" xmlns:lc="http://schemas.openxmlformats.org/drawingml/2006/lockedCanvas" xmlns:dgm="http://schemas.openxmlformats.org/drawingml/2006/diagram" xmlns:wps="http://schemas.microsoft.com/office/word/2010/wordprocessingShape" xmlns:wpg="http://schemas.microsoft.com/office/word/2010/wordprocessingGroup" xmlns:w14="http://schemas.microsoft.com/office/word/2010/wordml" xmlns:w15="http://schemas.microsoft.com/office/word/2012/wordml" xmlns:w16="http://schemas.microsoft.com/office/word/2018/wordml" xmlns:w16cex="http://schemas.microsoft.com/office/word/2018/wordml/cex" xmlns:w16cid="http://schemas.microsoft.com/office/word/2016/wordml/cid" xmlns="http://schemas.microsoft.com/office/tasks/2019/documenttasks" xmlns:cr="http://schemas.microsoft.com/office/comments/2020/reactions">
-  <w:comment w:author="Bao Nguyen" w:id="0" w:date="2026-04-30T20:41:20Z">
-    <w:p>
-      <w:pPr>
-        <w:keepNext w:val="0"/>
-        <w:keepLines w:val="0"/>
-        <w:pageBreakBefore w:val="0"/>
-        <w:widowControl w:val="0"/>
-        <w:pBdr>
-          <w:top w:space="0" w:sz="0" w:val="nil"/>
-          <w:left w:space="0" w:sz="0" w:val="nil"/>
-          <w:bottom w:space="0" w:sz="0" w:val="nil"/>
-          <w:right w:space="0" w:sz="0" w:val="nil"/>
-          <w:between w:space="0" w:sz="0" w:val="nil"/>
-        </w:pBdr>
-        <w:shd w:fill="auto" w:val="clear"/>
-        <w:spacing w:after="0" w:before="0" w:line="240" w:lineRule="auto"/>
-        <w:ind w:left="0" w:right="0" w:firstLine="0"/>
-        <w:jc w:val="left"/>
-        <w:rPr>
-          <w:rFonts w:ascii="Arial" w:cs="Arial" w:eastAsia="Arial" w:hAnsi="Arial"/>
-          <w:b w:val="0"/>
-          <w:bCs w:val="0"/>
-          <w:i w:val="0"/>
-          <w:iCs w:val="0"/>
-          <w:smallCaps w:val="0"/>
-          <w:strike w:val="0"/>
-          <w:color w:val="000000"/>
-          <w:sz w:val="22"/>
-          <w:szCs w:val="22"/>
-          <w:u w:val="none"/>
-          <w:shd w:fill="auto" w:val="clear"/>
-          <w:vertAlign w:val="baseline"/>
-        </w:rPr>
-      </w:pPr>
-      <w:r>
-        <w:rPr>
-          <w:rFonts w:ascii="Arial" w:cs="Arial" w:eastAsia="Arial" w:hAnsi="Arial"/>
-          <w:b w:val="0"/>
-          <w:bCs w:val="0"/>
-          <w:i w:val="0"/>
-          <w:iCs w:val="0"/>
-          <w:smallCaps w:val="0"/>
-          <w:strike w:val="0"/>
-          <w:color w:val="000000"/>
-          <w:sz w:val="22"/>
-          <w:szCs w:val="22"/>
-          <w:u w:val="none"/>
-          <w:shd w:fill="auto" w:val="clear"/>
-          <w:vertAlign w:val="baseline"/>
-          <w:rtl w:val="0"/>
-        </w:rPr>
-        <w:t xml:space="preserve">Explaination not needed. Will replace with og from lab manual.</w:t>
-      </w:r>
-    </w:p>
-  </w:comment>
-</w:comments>
+<w:comments xmlns:w="http://schemas.openxmlformats.org/wordprocessingml/2006/main"/>
 </file>
 
 <file path=word/commentsExtended.xml><?xml version="1.0" encoding="utf-8"?>
-<w15:commentsEx xmlns:mc="http://schemas.openxmlformats.org/markup-compatibility/2006" xmlns:o="urn:schemas-microsoft-com:office:office" xmlns:r="http://schemas.openxmlformats.org/officeDocument/2006/relationships" xmlns:m="http://schemas.openxmlformats.org/officeDocument/2006/math" xmlns:v="urn:schemas-microsoft-com:vml" xmlns:wp="http://schemas.openxmlformats.org/drawingml/2006/wordprocessingDrawing" xmlns:w10="urn:schemas-microsoft-com:office:word" xmlns:w="http://schemas.openxmlformats.org/wordprocessingml/2006/main" xmlns:wne="http://schemas.microsoft.com/office/word/2006/wordml" xmlns:sl="http://schemas.openxmlformats.org/schemaLibrary/2006/main" xmlns:a="http://schemas.openxmlformats.org/drawingml/2006/main" xmlns:pic="http://schemas.openxmlformats.org/drawingml/2006/picture" xmlns:c="http://schemas.openxmlformats.org/drawingml/2006/chart" xmlns:lc="http://schemas.openxmlformats.org/drawingml/2006/lockedCanvas" xmlns:dgm="http://schemas.openxmlformats.org/drawingml/2006/diagram" xmlns:wps="http://schemas.microsoft.com/office/word/2010/wordprocessingShape" xmlns:wpg="http://schemas.microsoft.com/office/word/2010/wordprocessingGroup" xmlns:w14="http://schemas.microsoft.com/office/word/2010/wordml" xmlns:w15="http://schemas.microsoft.com/office/word/2012/wordml" xmlns:w16="http://schemas.microsoft.com/office/word/2018/wordml" xmlns:w16cex="http://schemas.microsoft.com/office/word/2018/wordml/cex" xmlns:w16cid="http://schemas.microsoft.com/office/word/2016/wordml/cid" xmlns="http://schemas.microsoft.com/office/tasks/2019/documenttasks" xmlns:cr="http://schemas.microsoft.com/office/comments/2020/reactions">
-  <w15:commentEx w15:paraId="00000130" w15:done="0"/>
-</w15:commentsEx>
+<w15:commentsEx xmlns:w15="http://schemas.microsoft.com/office/word/2012/wordml"/>
 </file>
 
 <file path=word/numbering.xml><?xml version="1.0" encoding="utf-8"?>

</xml_diff>

<commit_message>
Fix table row spacing and bullet padding in Lab 3 report
Co-Authored-By: Claude Sonnet 4.6 <noreply@anthropic.com>
</commit_message>
<xml_diff>
--- a/Labs/Lab 3/ECE332_Lab3_Waveguides_Official.docx
+++ b/Labs/Lab 3/ECE332_Lab3_Waveguides_Official.docx
@@ -740,7 +740,7 @@
           <w:between w:space="0" w:sz="0" w:val="nil"/>
         </w:pBdr>
         <w:shd w:fill="auto" w:val="clear"/>
-        <w:spacing w:after="0" w:before="0" w:line="276" w:lineRule="auto"/>
+        <w:spacing w:after="40" w:before="0" w:line="240" w:lineRule="auto"/>
         <w:ind w:left="360" w:right="0" w:hanging="360"/>
         <w:jc w:val="left"/>
         <w:rPr/>
@@ -783,7 +783,7 @@
           <w:between w:space="0" w:sz="0" w:val="nil"/>
         </w:pBdr>
         <w:shd w:fill="auto" w:val="clear"/>
-        <w:spacing w:after="0" w:before="0" w:line="276" w:lineRule="auto"/>
+        <w:spacing w:after="40" w:before="0" w:line="240" w:lineRule="auto"/>
         <w:ind w:left="360" w:right="0" w:hanging="360"/>
         <w:jc w:val="left"/>
         <w:rPr/>
@@ -826,7 +826,7 @@
           <w:between w:space="0" w:sz="0" w:val="nil"/>
         </w:pBdr>
         <w:shd w:fill="auto" w:val="clear"/>
-        <w:spacing w:after="0" w:before="0" w:line="276" w:lineRule="auto"/>
+        <w:spacing w:after="40" w:before="0" w:line="240" w:lineRule="auto"/>
         <w:ind w:left="360" w:right="0" w:hanging="360"/>
         <w:jc w:val="left"/>
         <w:rPr/>
@@ -869,7 +869,7 @@
           <w:between w:space="0" w:sz="0" w:val="nil"/>
         </w:pBdr>
         <w:shd w:fill="auto" w:val="clear"/>
-        <w:spacing w:after="0" w:before="0" w:line="276" w:lineRule="auto"/>
+        <w:spacing w:after="40" w:before="0" w:line="240" w:lineRule="auto"/>
         <w:ind w:left="360" w:right="0" w:hanging="360"/>
         <w:jc w:val="left"/>
         <w:rPr/>
@@ -912,7 +912,7 @@
           <w:between w:space="0" w:sz="0" w:val="nil"/>
         </w:pBdr>
         <w:shd w:fill="auto" w:val="clear"/>
-        <w:spacing w:after="40" w:before="0" w:line="276" w:lineRule="auto"/>
+        <w:spacing w:after="40" w:before="0" w:line="240" w:lineRule="auto"/>
         <w:ind w:left="360" w:right="0" w:hanging="360"/>
         <w:jc w:val="left"/>
         <w:rPr/>
@@ -995,7 +995,7 @@
           <w:between w:space="0" w:sz="0" w:val="nil"/>
         </w:pBdr>
         <w:shd w:fill="auto" w:val="clear"/>
-        <w:spacing w:after="0" w:before="0" w:line="276" w:lineRule="auto"/>
+        <w:spacing w:after="40" w:before="0" w:line="240" w:lineRule="auto"/>
         <w:ind w:left="360" w:right="0" w:hanging="360"/>
         <w:jc w:val="left"/>
         <w:rPr/>
@@ -1038,7 +1038,7 @@
           <w:between w:space="0" w:sz="0" w:val="nil"/>
         </w:pBdr>
         <w:shd w:fill="auto" w:val="clear"/>
-        <w:spacing w:after="0" w:before="0" w:line="276" w:lineRule="auto"/>
+        <w:spacing w:after="40" w:before="0" w:line="240" w:lineRule="auto"/>
         <w:ind w:left="360" w:right="0" w:hanging="360"/>
         <w:jc w:val="left"/>
         <w:rPr/>
@@ -1081,7 +1081,7 @@
           <w:between w:space="0" w:sz="0" w:val="nil"/>
         </w:pBdr>
         <w:shd w:fill="auto" w:val="clear"/>
-        <w:spacing w:after="0" w:before="0" w:line="276" w:lineRule="auto"/>
+        <w:spacing w:after="40" w:before="0" w:line="240" w:lineRule="auto"/>
         <w:ind w:left="360" w:right="0" w:hanging="360"/>
         <w:jc w:val="left"/>
         <w:rPr/>
@@ -1124,7 +1124,7 @@
           <w:between w:space="0" w:sz="0" w:val="nil"/>
         </w:pBdr>
         <w:shd w:fill="auto" w:val="clear"/>
-        <w:spacing w:after="0" w:before="0" w:line="276" w:lineRule="auto"/>
+        <w:spacing w:after="40" w:before="0" w:line="240" w:lineRule="auto"/>
         <w:ind w:left="360" w:right="0" w:hanging="360"/>
         <w:jc w:val="left"/>
         <w:rPr/>
@@ -1167,7 +1167,7 @@
           <w:between w:space="0" w:sz="0" w:val="nil"/>
         </w:pBdr>
         <w:shd w:fill="auto" w:val="clear"/>
-        <w:spacing w:after="40" w:before="0" w:line="276" w:lineRule="auto"/>
+        <w:spacing w:after="40" w:before="0" w:line="240" w:lineRule="auto"/>
         <w:ind w:left="360" w:right="0" w:hanging="360"/>
         <w:jc w:val="left"/>
         <w:rPr/>
@@ -1267,6 +1267,10 @@
         </w:tblBorders>
         <w:tblLayout w:type="fixed"/>
         <w:tblLook w:val="0400"/>
+        <w:tblCellMar>
+          <w:top w:w="40" w:type="dxa"/>
+          <w:bottom w:w="40" w:type="dxa"/>
+        </w:tblCellMar>
       </w:tblPr>
       <w:tblGrid>
         <w:gridCol w:w="1728"/>
@@ -1294,19 +1298,21 @@
           <w:p>
             <w:pPr>
               <w:rPr/>
-            </w:pPr>
-            <w:r>
-              <w:rPr>
-                <w:rtl w:val="0"/>
-              </w:rPr>
-            </w:r>
-          </w:p>
-        </w:tc>
-        <w:tc>
-          <w:tcPr/>
-          <w:p>
-            <w:pPr>
-              <w:rPr/>
+              <w:spacing w:before="0" w:after="0" w:line="240" w:lineRule="auto"/>
+            </w:pPr>
+            <w:r>
+              <w:rPr>
+                <w:rtl w:val="0"/>
+              </w:rPr>
+            </w:r>
+          </w:p>
+        </w:tc>
+        <w:tc>
+          <w:tcPr/>
+          <w:p>
+            <w:pPr>
+              <w:rPr/>
+              <w:spacing w:before="0" w:after="0" w:line="240" w:lineRule="auto"/>
             </w:pPr>
             <w:r>
               <w:rPr>
@@ -1328,6 +1334,7 @@
           <w:p>
             <w:pPr>
               <w:rPr/>
+              <w:spacing w:before="0" w:after="0" w:line="240" w:lineRule="auto"/>
             </w:pPr>
             <w:r>
               <w:rPr>
@@ -1349,6 +1356,7 @@
           <w:p>
             <w:pPr>
               <w:rPr/>
+              <w:spacing w:before="0" w:after="0" w:line="240" w:lineRule="auto"/>
             </w:pPr>
             <w:r>
               <w:rPr>
@@ -1370,6 +1378,7 @@
           <w:p>
             <w:pPr>
               <w:rPr/>
+              <w:spacing w:before="0" w:after="0" w:line="240" w:lineRule="auto"/>
             </w:pPr>
             <w:r>
               <w:rPr>
@@ -1397,6 +1406,7 @@
           <w:p>
             <w:pPr>
               <w:rPr/>
+              <w:spacing w:before="0" w:after="0" w:line="240" w:lineRule="auto"/>
             </w:pPr>
             <w:r>
               <w:rPr>
@@ -1411,45 +1421,49 @@
           <w:p>
             <w:pPr>
               <w:rPr/>
-            </w:pPr>
-            <w:r>
-              <w:rPr>
-                <w:rtl w:val="0"/>
-              </w:rPr>
-            </w:r>
-          </w:p>
-        </w:tc>
-        <w:tc>
-          <w:tcPr/>
-          <w:p>
-            <w:pPr>
-              <w:rPr/>
-            </w:pPr>
-            <w:r>
-              <w:rPr>
-                <w:rtl w:val="0"/>
-              </w:rPr>
-            </w:r>
-          </w:p>
-        </w:tc>
-        <w:tc>
-          <w:tcPr/>
-          <w:p>
-            <w:pPr>
-              <w:rPr/>
-            </w:pPr>
-            <w:r>
-              <w:rPr>
-                <w:rtl w:val="0"/>
-              </w:rPr>
-            </w:r>
-          </w:p>
-        </w:tc>
-        <w:tc>
-          <w:tcPr/>
-          <w:p>
-            <w:pPr>
-              <w:rPr/>
+              <w:spacing w:before="0" w:after="0" w:line="240" w:lineRule="auto"/>
+            </w:pPr>
+            <w:r>
+              <w:rPr>
+                <w:rtl w:val="0"/>
+              </w:rPr>
+            </w:r>
+          </w:p>
+        </w:tc>
+        <w:tc>
+          <w:tcPr/>
+          <w:p>
+            <w:pPr>
+              <w:rPr/>
+              <w:spacing w:before="0" w:after="0" w:line="240" w:lineRule="auto"/>
+            </w:pPr>
+            <w:r>
+              <w:rPr>
+                <w:rtl w:val="0"/>
+              </w:rPr>
+            </w:r>
+          </w:p>
+        </w:tc>
+        <w:tc>
+          <w:tcPr/>
+          <w:p>
+            <w:pPr>
+              <w:rPr/>
+              <w:spacing w:before="0" w:after="0" w:line="240" w:lineRule="auto"/>
+            </w:pPr>
+            <w:r>
+              <w:rPr>
+                <w:rtl w:val="0"/>
+              </w:rPr>
+            </w:r>
+          </w:p>
+        </w:tc>
+        <w:tc>
+          <w:tcPr/>
+          <w:p>
+            <w:pPr>
+              <w:rPr/>
+              <w:spacing w:before="0" w:after="0" w:line="240" w:lineRule="auto"/>
             </w:pPr>
             <w:r>
               <w:rPr>
@@ -1469,6 +1483,7 @@
           <w:p>
             <w:pPr>
               <w:rPr/>
+              <w:spacing w:before="0" w:after="0" w:line="240" w:lineRule="auto"/>
             </w:pPr>
             <w:r>
               <w:rPr>
@@ -1483,6 +1498,7 @@
           <w:p>
             <w:pPr>
               <w:rPr/>
+              <w:spacing w:before="0" w:after="0" w:line="240" w:lineRule="auto"/>
             </w:pPr>
             <w:r>
               <w:rPr>
@@ -1497,6 +1513,7 @@
           <w:p>
             <w:pPr>
               <w:rPr/>
+              <w:spacing w:before="0" w:after="0" w:line="240" w:lineRule="auto"/>
             </w:pPr>
             <w:r>
               <w:rPr>
@@ -1511,6 +1528,7 @@
           <w:p>
             <w:pPr>
               <w:rPr/>
+              <w:spacing w:before="0" w:after="0" w:line="240" w:lineRule="auto"/>
             </w:pPr>
             <w:r>
               <w:rPr>
@@ -1525,6 +1543,7 @@
           <w:p>
             <w:pPr>
               <w:rPr/>
+              <w:spacing w:before="0" w:after="0" w:line="240" w:lineRule="auto"/>
             </w:pPr>
             <w:r>
               <w:rPr>
@@ -1545,6 +1564,7 @@
           <w:p>
             <w:pPr>
               <w:rPr/>
+              <w:spacing w:before="0" w:after="0" w:line="240" w:lineRule="auto"/>
             </w:pPr>
             <w:r>
               <w:rPr>
@@ -1559,6 +1579,7 @@
           <w:p>
             <w:pPr>
               <w:rPr/>
+              <w:spacing w:before="0" w:after="0" w:line="240" w:lineRule="auto"/>
             </w:pPr>
             <w:r>
               <w:rPr>
@@ -1573,6 +1594,7 @@
           <w:p>
             <w:pPr>
               <w:rPr/>
+              <w:spacing w:before="0" w:after="0" w:line="240" w:lineRule="auto"/>
             </w:pPr>
             <w:r>
               <w:rPr>
@@ -1587,6 +1609,7 @@
           <w:p>
             <w:pPr>
               <w:rPr/>
+              <w:spacing w:before="0" w:after="0" w:line="240" w:lineRule="auto"/>
             </w:pPr>
             <w:r>
               <w:rPr>
@@ -1601,6 +1624,7 @@
           <w:p>
             <w:pPr>
               <w:rPr/>
+              <w:spacing w:before="0" w:after="0" w:line="240" w:lineRule="auto"/>
             </w:pPr>
             <w:r>
               <w:rPr>
@@ -1621,6 +1645,7 @@
           <w:p>
             <w:pPr>
               <w:rPr/>
+              <w:spacing w:before="0" w:after="0" w:line="240" w:lineRule="auto"/>
             </w:pPr>
             <w:r>
               <w:rPr>
@@ -1635,6 +1660,7 @@
           <w:p>
             <w:pPr>
               <w:rPr/>
+              <w:spacing w:before="0" w:after="0" w:line="240" w:lineRule="auto"/>
             </w:pPr>
             <w:r>
               <w:rPr>
@@ -1649,6 +1675,7 @@
           <w:p>
             <w:pPr>
               <w:rPr/>
+              <w:spacing w:before="0" w:after="0" w:line="240" w:lineRule="auto"/>
             </w:pPr>
             <w:r>
               <w:rPr>
@@ -1663,6 +1690,7 @@
           <w:p>
             <w:pPr>
               <w:rPr/>
+              <w:spacing w:before="0" w:after="0" w:line="240" w:lineRule="auto"/>
             </w:pPr>
             <w:r>
               <w:rPr>
@@ -1677,6 +1705,7 @@
           <w:p>
             <w:pPr>
               <w:rPr/>
+              <w:spacing w:before="0" w:after="0" w:line="240" w:lineRule="auto"/>
             </w:pPr>
             <w:r>
               <w:rPr>
@@ -1697,6 +1726,7 @@
           <w:p>
             <w:pPr>
               <w:rPr/>
+              <w:spacing w:before="0" w:after="0" w:line="240" w:lineRule="auto"/>
             </w:pPr>
             <w:r>
               <w:rPr>
@@ -1711,6 +1741,7 @@
           <w:p>
             <w:pPr>
               <w:rPr/>
+              <w:spacing w:before="0" w:after="0" w:line="240" w:lineRule="auto"/>
             </w:pPr>
             <w:r>
               <w:rPr>
@@ -1725,6 +1756,7 @@
           <w:p>
             <w:pPr>
               <w:rPr/>
+              <w:spacing w:before="0" w:after="0" w:line="240" w:lineRule="auto"/>
             </w:pPr>
             <w:r>
               <w:rPr>
@@ -1739,6 +1771,7 @@
           <w:p>
             <w:pPr>
               <w:rPr/>
+              <w:spacing w:before="0" w:after="0" w:line="240" w:lineRule="auto"/>
             </w:pPr>
             <w:r>
               <w:rPr>
@@ -1753,6 +1786,7 @@
           <w:p>
             <w:pPr>
               <w:rPr/>
+              <w:spacing w:before="0" w:after="0" w:line="240" w:lineRule="auto"/>
             </w:pPr>
             <w:r>
               <w:rPr>
@@ -1773,6 +1807,7 @@
           <w:p>
             <w:pPr>
               <w:rPr/>
+              <w:spacing w:before="0" w:after="0" w:line="240" w:lineRule="auto"/>
             </w:pPr>
             <w:r>
               <w:rPr>
@@ -1787,6 +1822,7 @@
           <w:p>
             <w:pPr>
               <w:rPr/>
+              <w:spacing w:before="0" w:after="0" w:line="240" w:lineRule="auto"/>
             </w:pPr>
             <w:r>
               <w:rPr>
@@ -1801,6 +1837,7 @@
           <w:p>
             <w:pPr>
               <w:rPr/>
+              <w:spacing w:before="0" w:after="0" w:line="240" w:lineRule="auto"/>
             </w:pPr>
             <w:r>
               <w:rPr>
@@ -1815,6 +1852,7 @@
           <w:p>
             <w:pPr>
               <w:rPr/>
+              <w:spacing w:before="0" w:after="0" w:line="240" w:lineRule="auto"/>
             </w:pPr>
             <w:r>
               <w:rPr>
@@ -1829,6 +1867,7 @@
           <w:p>
             <w:pPr>
               <w:rPr/>
+              <w:spacing w:before="0" w:after="0" w:line="240" w:lineRule="auto"/>
             </w:pPr>
             <w:r>
               <w:rPr>
@@ -1849,6 +1888,7 @@
           <w:p>
             <w:pPr>
               <w:rPr/>
+              <w:spacing w:before="0" w:after="0" w:line="240" w:lineRule="auto"/>
             </w:pPr>
             <w:r>
               <w:rPr>
@@ -1863,6 +1903,7 @@
           <w:p>
             <w:pPr>
               <w:rPr/>
+              <w:spacing w:before="0" w:after="0" w:line="240" w:lineRule="auto"/>
             </w:pPr>
             <w:r>
               <w:rPr>
@@ -1877,32 +1918,35 @@
           <w:p>
             <w:pPr>
               <w:rPr/>
-            </w:pPr>
-            <w:r>
-              <w:rPr>
-                <w:rtl w:val="0"/>
-              </w:rPr>
-            </w:r>
-          </w:p>
-        </w:tc>
-        <w:tc>
-          <w:tcPr/>
-          <w:p>
-            <w:pPr>
-              <w:rPr/>
-            </w:pPr>
-            <w:r>
-              <w:rPr>
-                <w:rtl w:val="0"/>
-              </w:rPr>
-            </w:r>
-          </w:p>
-        </w:tc>
-        <w:tc>
-          <w:tcPr/>
-          <w:p>
-            <w:pPr>
-              <w:rPr/>
+              <w:spacing w:before="0" w:after="0" w:line="240" w:lineRule="auto"/>
+            </w:pPr>
+            <w:r>
+              <w:rPr>
+                <w:rtl w:val="0"/>
+              </w:rPr>
+            </w:r>
+          </w:p>
+        </w:tc>
+        <w:tc>
+          <w:tcPr/>
+          <w:p>
+            <w:pPr>
+              <w:rPr/>
+              <w:spacing w:before="0" w:after="0" w:line="240" w:lineRule="auto"/>
+            </w:pPr>
+            <w:r>
+              <w:rPr>
+                <w:rtl w:val="0"/>
+              </w:rPr>
+            </w:r>
+          </w:p>
+        </w:tc>
+        <w:tc>
+          <w:tcPr/>
+          <w:p>
+            <w:pPr>
+              <w:rPr/>
+              <w:spacing w:before="0" w:after="0" w:line="240" w:lineRule="auto"/>
             </w:pPr>
             <w:r>
               <w:rPr>
@@ -1922,19 +1966,21 @@
           <w:p>
             <w:pPr>
               <w:rPr/>
-            </w:pPr>
-            <w:r>
-              <w:rPr>
-                <w:rtl w:val="0"/>
-              </w:rPr>
-            </w:r>
-          </w:p>
-        </w:tc>
-        <w:tc>
-          <w:tcPr/>
-          <w:p>
-            <w:pPr>
-              <w:rPr/>
+              <w:spacing w:before="0" w:after="0" w:line="240" w:lineRule="auto"/>
+            </w:pPr>
+            <w:r>
+              <w:rPr>
+                <w:rtl w:val="0"/>
+              </w:rPr>
+            </w:r>
+          </w:p>
+        </w:tc>
+        <w:tc>
+          <w:tcPr/>
+          <w:p>
+            <w:pPr>
+              <w:rPr/>
+              <w:spacing w:before="0" w:after="0" w:line="240" w:lineRule="auto"/>
             </w:pPr>
             <w:r>
               <w:rPr>
@@ -1949,6 +1995,7 @@
           <w:p>
             <w:pPr>
               <w:rPr/>
+              <w:spacing w:before="0" w:after="0" w:line="240" w:lineRule="auto"/>
             </w:pPr>
             <w:r>
               <w:rPr>
@@ -1963,6 +2010,7 @@
           <w:p>
             <w:pPr>
               <w:rPr/>
+              <w:spacing w:before="0" w:after="0" w:line="240" w:lineRule="auto"/>
             </w:pPr>
             <w:r>
               <w:rPr>
@@ -1977,6 +2025,7 @@
           <w:p>
             <w:pPr>
               <w:rPr/>
+              <w:spacing w:before="0" w:after="0" w:line="240" w:lineRule="auto"/>
             </w:pPr>
             <w:r>
               <w:rPr>
@@ -1997,6 +2046,7 @@
           <w:p>
             <w:pPr>
               <w:rPr/>
+              <w:spacing w:before="0" w:after="0" w:line="240" w:lineRule="auto"/>
             </w:pPr>
             <w:r>
               <w:rPr>
@@ -2011,45 +2061,49 @@
           <w:p>
             <w:pPr>
               <w:rPr/>
-            </w:pPr>
-            <w:r>
-              <w:rPr>
-                <w:rtl w:val="0"/>
-              </w:rPr>
-            </w:r>
-          </w:p>
-        </w:tc>
-        <w:tc>
-          <w:tcPr/>
-          <w:p>
-            <w:pPr>
-              <w:rPr/>
-            </w:pPr>
-            <w:r>
-              <w:rPr>
-                <w:rtl w:val="0"/>
-              </w:rPr>
-            </w:r>
-          </w:p>
-        </w:tc>
-        <w:tc>
-          <w:tcPr/>
-          <w:p>
-            <w:pPr>
-              <w:rPr/>
-            </w:pPr>
-            <w:r>
-              <w:rPr>
-                <w:rtl w:val="0"/>
-              </w:rPr>
-            </w:r>
-          </w:p>
-        </w:tc>
-        <w:tc>
-          <w:tcPr/>
-          <w:p>
-            <w:pPr>
-              <w:rPr/>
+              <w:spacing w:before="0" w:after="0" w:line="240" w:lineRule="auto"/>
+            </w:pPr>
+            <w:r>
+              <w:rPr>
+                <w:rtl w:val="0"/>
+              </w:rPr>
+            </w:r>
+          </w:p>
+        </w:tc>
+        <w:tc>
+          <w:tcPr/>
+          <w:p>
+            <w:pPr>
+              <w:rPr/>
+              <w:spacing w:before="0" w:after="0" w:line="240" w:lineRule="auto"/>
+            </w:pPr>
+            <w:r>
+              <w:rPr>
+                <w:rtl w:val="0"/>
+              </w:rPr>
+            </w:r>
+          </w:p>
+        </w:tc>
+        <w:tc>
+          <w:tcPr/>
+          <w:p>
+            <w:pPr>
+              <w:rPr/>
+              <w:spacing w:before="0" w:after="0" w:line="240" w:lineRule="auto"/>
+            </w:pPr>
+            <w:r>
+              <w:rPr>
+                <w:rtl w:val="0"/>
+              </w:rPr>
+            </w:r>
+          </w:p>
+        </w:tc>
+        <w:tc>
+          <w:tcPr/>
+          <w:p>
+            <w:pPr>
+              <w:rPr/>
+              <w:spacing w:before="0" w:after="0" w:line="240" w:lineRule="auto"/>
             </w:pPr>
             <w:r>
               <w:rPr>
@@ -2069,6 +2123,7 @@
           <w:p>
             <w:pPr>
               <w:rPr/>
+              <w:spacing w:before="0" w:after="0" w:line="240" w:lineRule="auto"/>
             </w:pPr>
             <w:r>
               <w:rPr>
@@ -2083,6 +2138,7 @@
           <w:p>
             <w:pPr>
               <w:rPr/>
+              <w:spacing w:before="0" w:after="0" w:line="240" w:lineRule="auto"/>
             </w:pPr>
             <w:r>
               <w:rPr>
@@ -2097,6 +2153,7 @@
           <w:p>
             <w:pPr>
               <w:rPr/>
+              <w:spacing w:before="0" w:after="0" w:line="240" w:lineRule="auto"/>
             </w:pPr>
             <w:r>
               <w:rPr>
@@ -2111,6 +2168,7 @@
           <w:p>
             <w:pPr>
               <w:rPr/>
+              <w:spacing w:before="0" w:after="0" w:line="240" w:lineRule="auto"/>
             </w:pPr>
             <w:r>
               <w:rPr>
@@ -2125,6 +2183,7 @@
           <w:p>
             <w:pPr>
               <w:rPr/>
+              <w:spacing w:before="0" w:after="0" w:line="240" w:lineRule="auto"/>
             </w:pPr>
             <w:r>
               <w:rPr>
@@ -2145,6 +2204,7 @@
           <w:p>
             <w:pPr>
               <w:rPr/>
+              <w:spacing w:before="0" w:after="0" w:line="240" w:lineRule="auto"/>
             </w:pPr>
             <w:r>
               <w:rPr>
@@ -2159,6 +2219,7 @@
           <w:p>
             <w:pPr>
               <w:rPr/>
+              <w:spacing w:before="0" w:after="0" w:line="240" w:lineRule="auto"/>
             </w:pPr>
             <w:r>
               <w:rPr>
@@ -2173,6 +2234,7 @@
           <w:p>
             <w:pPr>
               <w:rPr/>
+              <w:spacing w:before="0" w:after="0" w:line="240" w:lineRule="auto"/>
             </w:pPr>
             <w:r>
               <w:rPr>
@@ -2187,6 +2249,7 @@
           <w:p>
             <w:pPr>
               <w:rPr/>
+              <w:spacing w:before="0" w:after="0" w:line="240" w:lineRule="auto"/>
             </w:pPr>
             <w:r>
               <w:rPr>
@@ -2201,6 +2264,7 @@
           <w:p>
             <w:pPr>
               <w:rPr/>
+              <w:spacing w:before="0" w:after="0" w:line="240" w:lineRule="auto"/>
             </w:pPr>
             <w:r>
               <w:rPr>
@@ -2221,6 +2285,7 @@
           <w:p>
             <w:pPr>
               <w:rPr/>
+              <w:spacing w:before="0" w:after="0" w:line="240" w:lineRule="auto"/>
             </w:pPr>
             <w:r>
               <w:rPr>
@@ -2235,6 +2300,7 @@
           <w:p>
             <w:pPr>
               <w:rPr/>
+              <w:spacing w:before="0" w:after="0" w:line="240" w:lineRule="auto"/>
             </w:pPr>
             <w:r>
               <w:rPr>
@@ -2249,6 +2315,7 @@
           <w:p>
             <w:pPr>
               <w:rPr/>
+              <w:spacing w:before="0" w:after="0" w:line="240" w:lineRule="auto"/>
             </w:pPr>
             <w:r>
               <w:rPr>
@@ -2263,6 +2330,7 @@
           <w:p>
             <w:pPr>
               <w:rPr/>
+              <w:spacing w:before="0" w:after="0" w:line="240" w:lineRule="auto"/>
             </w:pPr>
             <w:r>
               <w:rPr>
@@ -2277,6 +2345,7 @@
           <w:p>
             <w:pPr>
               <w:rPr/>
+              <w:spacing w:before="0" w:after="0" w:line="240" w:lineRule="auto"/>
             </w:pPr>
             <w:r>
               <w:rPr>
@@ -2297,6 +2366,7 @@
           <w:p>
             <w:pPr>
               <w:rPr/>
+              <w:spacing w:before="0" w:after="0" w:line="240" w:lineRule="auto"/>
             </w:pPr>
             <w:r>
               <w:rPr>
@@ -2311,6 +2381,7 @@
           <w:p>
             <w:pPr>
               <w:rPr/>
+              <w:spacing w:before="0" w:after="0" w:line="240" w:lineRule="auto"/>
             </w:pPr>
             <w:r>
               <w:rPr>
@@ -2325,6 +2396,7 @@
           <w:p>
             <w:pPr>
               <w:rPr/>
+              <w:spacing w:before="0" w:after="0" w:line="240" w:lineRule="auto"/>
             </w:pPr>
             <w:r>
               <w:rPr>
@@ -2339,6 +2411,7 @@
           <w:p>
             <w:pPr>
               <w:rPr/>
+              <w:spacing w:before="0" w:after="0" w:line="240" w:lineRule="auto"/>
             </w:pPr>
             <w:r>
               <w:rPr>
@@ -2353,6 +2426,7 @@
           <w:p>
             <w:pPr>
               <w:rPr/>
+              <w:spacing w:before="0" w:after="0" w:line="240" w:lineRule="auto"/>
             </w:pPr>
             <w:r>
               <w:rPr>
@@ -2373,6 +2447,7 @@
           <w:p>
             <w:pPr>
               <w:rPr/>
+              <w:spacing w:before="0" w:after="0" w:line="240" w:lineRule="auto"/>
             </w:pPr>
             <w:r>
               <w:rPr>
@@ -2387,6 +2462,7 @@
           <w:p>
             <w:pPr>
               <w:rPr/>
+              <w:spacing w:before="0" w:after="0" w:line="240" w:lineRule="auto"/>
             </w:pPr>
             <w:r>
               <w:rPr>
@@ -2401,6 +2477,7 @@
           <w:p>
             <w:pPr>
               <w:rPr/>
+              <w:spacing w:before="0" w:after="0" w:line="240" w:lineRule="auto"/>
             </w:pPr>
             <w:r>
               <w:rPr>
@@ -2415,6 +2492,7 @@
           <w:p>
             <w:pPr>
               <w:rPr/>
+              <w:spacing w:before="0" w:after="0" w:line="240" w:lineRule="auto"/>
             </w:pPr>
             <w:r>
               <w:rPr>
@@ -2429,6 +2507,7 @@
           <w:p>
             <w:pPr>
               <w:rPr/>
+              <w:spacing w:before="0" w:after="0" w:line="240" w:lineRule="auto"/>
             </w:pPr>
             <w:r>
               <w:rPr>
@@ -2449,6 +2528,7 @@
           <w:p>
             <w:pPr>
               <w:rPr/>
+              <w:spacing w:before="0" w:after="0" w:line="240" w:lineRule="auto"/>
             </w:pPr>
             <w:r>
               <w:rPr>
@@ -2463,6 +2543,7 @@
           <w:p>
             <w:pPr>
               <w:rPr/>
+              <w:spacing w:before="0" w:after="0" w:line="240" w:lineRule="auto"/>
             </w:pPr>
             <w:r>
               <w:rPr>
@@ -2477,32 +2558,35 @@
           <w:p>
             <w:pPr>
               <w:rPr/>
-            </w:pPr>
-            <w:r>
-              <w:rPr>
-                <w:rtl w:val="0"/>
-              </w:rPr>
-            </w:r>
-          </w:p>
-        </w:tc>
-        <w:tc>
-          <w:tcPr/>
-          <w:p>
-            <w:pPr>
-              <w:rPr/>
-            </w:pPr>
-            <w:r>
-              <w:rPr>
-                <w:rtl w:val="0"/>
-              </w:rPr>
-            </w:r>
-          </w:p>
-        </w:tc>
-        <w:tc>
-          <w:tcPr/>
-          <w:p>
-            <w:pPr>
-              <w:rPr/>
+              <w:spacing w:before="0" w:after="0" w:line="240" w:lineRule="auto"/>
+            </w:pPr>
+            <w:r>
+              <w:rPr>
+                <w:rtl w:val="0"/>
+              </w:rPr>
+            </w:r>
+          </w:p>
+        </w:tc>
+        <w:tc>
+          <w:tcPr/>
+          <w:p>
+            <w:pPr>
+              <w:rPr/>
+              <w:spacing w:before="0" w:after="0" w:line="240" w:lineRule="auto"/>
+            </w:pPr>
+            <w:r>
+              <w:rPr>
+                <w:rtl w:val="0"/>
+              </w:rPr>
+            </w:r>
+          </w:p>
+        </w:tc>
+        <w:tc>
+          <w:tcPr/>
+          <w:p>
+            <w:pPr>
+              <w:rPr/>
+              <w:spacing w:before="0" w:after="0" w:line="240" w:lineRule="auto"/>
             </w:pPr>
             <w:r>
               <w:rPr>
@@ -2522,19 +2606,21 @@
           <w:p>
             <w:pPr>
               <w:rPr/>
-            </w:pPr>
-            <w:r>
-              <w:rPr>
-                <w:rtl w:val="0"/>
-              </w:rPr>
-            </w:r>
-          </w:p>
-        </w:tc>
-        <w:tc>
-          <w:tcPr/>
-          <w:p>
-            <w:pPr>
-              <w:rPr/>
+              <w:spacing w:before="0" w:after="0" w:line="240" w:lineRule="auto"/>
+            </w:pPr>
+            <w:r>
+              <w:rPr>
+                <w:rtl w:val="0"/>
+              </w:rPr>
+            </w:r>
+          </w:p>
+        </w:tc>
+        <w:tc>
+          <w:tcPr/>
+          <w:p>
+            <w:pPr>
+              <w:rPr/>
+              <w:spacing w:before="0" w:after="0" w:line="240" w:lineRule="auto"/>
             </w:pPr>
             <w:r>
               <w:rPr>
@@ -2549,6 +2635,7 @@
           <w:p>
             <w:pPr>
               <w:rPr/>
+              <w:spacing w:before="0" w:after="0" w:line="240" w:lineRule="auto"/>
             </w:pPr>
             <w:r>
               <w:rPr>
@@ -2563,6 +2650,7 @@
           <w:p>
             <w:pPr>
               <w:rPr/>
+              <w:spacing w:before="0" w:after="0" w:line="240" w:lineRule="auto"/>
             </w:pPr>
             <w:r>
               <w:rPr>
@@ -2577,6 +2665,7 @@
           <w:p>
             <w:pPr>
               <w:rPr/>
+              <w:spacing w:before="0" w:after="0" w:line="240" w:lineRule="auto"/>
             </w:pPr>
             <w:r>
               <w:rPr>
@@ -2597,6 +2686,7 @@
           <w:p>
             <w:pPr>
               <w:rPr/>
+              <w:spacing w:before="0" w:after="0" w:line="240" w:lineRule="auto"/>
             </w:pPr>
             <w:r>
               <w:rPr>
@@ -2611,45 +2701,49 @@
           <w:p>
             <w:pPr>
               <w:rPr/>
-            </w:pPr>
-            <w:r>
-              <w:rPr>
-                <w:rtl w:val="0"/>
-              </w:rPr>
-            </w:r>
-          </w:p>
-        </w:tc>
-        <w:tc>
-          <w:tcPr/>
-          <w:p>
-            <w:pPr>
-              <w:rPr/>
-            </w:pPr>
-            <w:r>
-              <w:rPr>
-                <w:rtl w:val="0"/>
-              </w:rPr>
-            </w:r>
-          </w:p>
-        </w:tc>
-        <w:tc>
-          <w:tcPr/>
-          <w:p>
-            <w:pPr>
-              <w:rPr/>
-            </w:pPr>
-            <w:r>
-              <w:rPr>
-                <w:rtl w:val="0"/>
-              </w:rPr>
-            </w:r>
-          </w:p>
-        </w:tc>
-        <w:tc>
-          <w:tcPr/>
-          <w:p>
-            <w:pPr>
-              <w:rPr/>
+              <w:spacing w:before="0" w:after="0" w:line="240" w:lineRule="auto"/>
+            </w:pPr>
+            <w:r>
+              <w:rPr>
+                <w:rtl w:val="0"/>
+              </w:rPr>
+            </w:r>
+          </w:p>
+        </w:tc>
+        <w:tc>
+          <w:tcPr/>
+          <w:p>
+            <w:pPr>
+              <w:rPr/>
+              <w:spacing w:before="0" w:after="0" w:line="240" w:lineRule="auto"/>
+            </w:pPr>
+            <w:r>
+              <w:rPr>
+                <w:rtl w:val="0"/>
+              </w:rPr>
+            </w:r>
+          </w:p>
+        </w:tc>
+        <w:tc>
+          <w:tcPr/>
+          <w:p>
+            <w:pPr>
+              <w:rPr/>
+              <w:spacing w:before="0" w:after="0" w:line="240" w:lineRule="auto"/>
+            </w:pPr>
+            <w:r>
+              <w:rPr>
+                <w:rtl w:val="0"/>
+              </w:rPr>
+            </w:r>
+          </w:p>
+        </w:tc>
+        <w:tc>
+          <w:tcPr/>
+          <w:p>
+            <w:pPr>
+              <w:rPr/>
+              <w:spacing w:before="0" w:after="0" w:line="240" w:lineRule="auto"/>
             </w:pPr>
             <w:r>
               <w:rPr>
@@ -2669,6 +2763,7 @@
           <w:p>
             <w:pPr>
               <w:rPr/>
+              <w:spacing w:before="0" w:after="0" w:line="240" w:lineRule="auto"/>
             </w:pPr>
             <w:r>
               <w:rPr>
@@ -2683,6 +2778,7 @@
           <w:p>
             <w:pPr>
               <w:rPr/>
+              <w:spacing w:before="0" w:after="0" w:line="240" w:lineRule="auto"/>
             </w:pPr>
             <w:r>
               <w:rPr>
@@ -2697,6 +2793,7 @@
           <w:p>
             <w:pPr>
               <w:rPr/>
+              <w:spacing w:before="0" w:after="0" w:line="240" w:lineRule="auto"/>
             </w:pPr>
             <w:r>
               <w:rPr>
@@ -2711,6 +2808,7 @@
           <w:p>
             <w:pPr>
               <w:rPr/>
+              <w:spacing w:before="0" w:after="0" w:line="240" w:lineRule="auto"/>
             </w:pPr>
             <w:r>
               <w:rPr>
@@ -2725,6 +2823,7 @@
           <w:p>
             <w:pPr>
               <w:rPr/>
+              <w:spacing w:before="0" w:after="0" w:line="240" w:lineRule="auto"/>
             </w:pPr>
             <w:r>
               <w:rPr>
@@ -2745,6 +2844,7 @@
           <w:p>
             <w:pPr>
               <w:rPr/>
+              <w:spacing w:before="0" w:after="0" w:line="240" w:lineRule="auto"/>
             </w:pPr>
             <w:r>
               <w:rPr>
@@ -2759,6 +2859,7 @@
           <w:p>
             <w:pPr>
               <w:rPr/>
+              <w:spacing w:before="0" w:after="0" w:line="240" w:lineRule="auto"/>
             </w:pPr>
             <w:r>
               <w:rPr>
@@ -2773,6 +2874,7 @@
           <w:p>
             <w:pPr>
               <w:rPr/>
+              <w:spacing w:before="0" w:after="0" w:line="240" w:lineRule="auto"/>
             </w:pPr>
             <w:r>
               <w:rPr>
@@ -2787,6 +2889,7 @@
           <w:p>
             <w:pPr>
               <w:rPr/>
+              <w:spacing w:before="0" w:after="0" w:line="240" w:lineRule="auto"/>
             </w:pPr>
             <w:r>
               <w:rPr>
@@ -2801,6 +2904,7 @@
           <w:p>
             <w:pPr>
               <w:rPr/>
+              <w:spacing w:before="0" w:after="0" w:line="240" w:lineRule="auto"/>
             </w:pPr>
             <w:r>
               <w:rPr>
@@ -2821,6 +2925,7 @@
           <w:p>
             <w:pPr>
               <w:rPr/>
+              <w:spacing w:before="0" w:after="0" w:line="240" w:lineRule="auto"/>
             </w:pPr>
             <w:r>
               <w:rPr>
@@ -2835,6 +2940,7 @@
           <w:p>
             <w:pPr>
               <w:rPr/>
+              <w:spacing w:before="0" w:after="0" w:line="240" w:lineRule="auto"/>
             </w:pPr>
             <w:r>
               <w:rPr>
@@ -2849,6 +2955,7 @@
           <w:p>
             <w:pPr>
               <w:rPr/>
+              <w:spacing w:before="0" w:after="0" w:line="240" w:lineRule="auto"/>
             </w:pPr>
             <w:r>
               <w:rPr>
@@ -2863,6 +2970,7 @@
           <w:p>
             <w:pPr>
               <w:rPr/>
+              <w:spacing w:before="0" w:after="0" w:line="240" w:lineRule="auto"/>
             </w:pPr>
             <w:r>
               <w:rPr>
@@ -2877,6 +2985,7 @@
           <w:p>
             <w:pPr>
               <w:rPr/>
+              <w:spacing w:before="0" w:after="0" w:line="240" w:lineRule="auto"/>
             </w:pPr>
             <w:r>
               <w:rPr>
@@ -2897,6 +3006,7 @@
           <w:p>
             <w:pPr>
               <w:rPr/>
+              <w:spacing w:before="0" w:after="0" w:line="240" w:lineRule="auto"/>
             </w:pPr>
             <w:r>
               <w:rPr>
@@ -2911,6 +3021,7 @@
           <w:p>
             <w:pPr>
               <w:rPr/>
+              <w:spacing w:before="0" w:after="0" w:line="240" w:lineRule="auto"/>
             </w:pPr>
             <w:r>
               <w:rPr>
@@ -2925,6 +3036,7 @@
           <w:p>
             <w:pPr>
               <w:rPr/>
+              <w:spacing w:before="0" w:after="0" w:line="240" w:lineRule="auto"/>
             </w:pPr>
             <w:r>
               <w:rPr>
@@ -2939,6 +3051,7 @@
           <w:p>
             <w:pPr>
               <w:rPr/>
+              <w:spacing w:before="0" w:after="0" w:line="240" w:lineRule="auto"/>
             </w:pPr>
             <w:r>
               <w:rPr>
@@ -2953,6 +3066,7 @@
           <w:p>
             <w:pPr>
               <w:rPr/>
+              <w:spacing w:before="0" w:after="0" w:line="240" w:lineRule="auto"/>
             </w:pPr>
             <w:r>
               <w:rPr>
@@ -2973,6 +3087,7 @@
           <w:p>
             <w:pPr>
               <w:rPr/>
+              <w:spacing w:before="0" w:after="0" w:line="240" w:lineRule="auto"/>
             </w:pPr>
             <w:r>
               <w:rPr>
@@ -2987,6 +3102,7 @@
           <w:p>
             <w:pPr>
               <w:rPr/>
+              <w:spacing w:before="0" w:after="0" w:line="240" w:lineRule="auto"/>
             </w:pPr>
             <w:r>
               <w:rPr>
@@ -3001,6 +3117,7 @@
           <w:p>
             <w:pPr>
               <w:rPr/>
+              <w:spacing w:before="0" w:after="0" w:line="240" w:lineRule="auto"/>
             </w:pPr>
             <w:r>
               <w:rPr>
@@ -3015,6 +3132,7 @@
           <w:p>
             <w:pPr>
               <w:rPr/>
+              <w:spacing w:before="0" w:after="0" w:line="240" w:lineRule="auto"/>
             </w:pPr>
             <w:r>
               <w:rPr>
@@ -3029,6 +3147,7 @@
           <w:p>
             <w:pPr>
               <w:rPr/>
+              <w:spacing w:before="0" w:after="0" w:line="240" w:lineRule="auto"/>
             </w:pPr>
             <w:r>
               <w:rPr>
@@ -3049,6 +3168,7 @@
           <w:p>
             <w:pPr>
               <w:rPr/>
+              <w:spacing w:before="0" w:after="0" w:line="240" w:lineRule="auto"/>
             </w:pPr>
             <w:r>
               <w:rPr>
@@ -3063,6 +3183,7 @@
           <w:p>
             <w:pPr>
               <w:rPr/>
+              <w:spacing w:before="0" w:after="0" w:line="240" w:lineRule="auto"/>
             </w:pPr>
             <w:r>
               <w:rPr>
@@ -3077,32 +3198,35 @@
           <w:p>
             <w:pPr>
               <w:rPr/>
-            </w:pPr>
-            <w:r>
-              <w:rPr>
-                <w:rtl w:val="0"/>
-              </w:rPr>
-            </w:r>
-          </w:p>
-        </w:tc>
-        <w:tc>
-          <w:tcPr/>
-          <w:p>
-            <w:pPr>
-              <w:rPr/>
-            </w:pPr>
-            <w:r>
-              <w:rPr>
-                <w:rtl w:val="0"/>
-              </w:rPr>
-            </w:r>
-          </w:p>
-        </w:tc>
-        <w:tc>
-          <w:tcPr/>
-          <w:p>
-            <w:pPr>
-              <w:rPr/>
+              <w:spacing w:before="0" w:after="0" w:line="240" w:lineRule="auto"/>
+            </w:pPr>
+            <w:r>
+              <w:rPr>
+                <w:rtl w:val="0"/>
+              </w:rPr>
+            </w:r>
+          </w:p>
+        </w:tc>
+        <w:tc>
+          <w:tcPr/>
+          <w:p>
+            <w:pPr>
+              <w:rPr/>
+              <w:spacing w:before="0" w:after="0" w:line="240" w:lineRule="auto"/>
+            </w:pPr>
+            <w:r>
+              <w:rPr>
+                <w:rtl w:val="0"/>
+              </w:rPr>
+            </w:r>
+          </w:p>
+        </w:tc>
+        <w:tc>
+          <w:tcPr/>
+          <w:p>
+            <w:pPr>
+              <w:rPr/>
+              <w:spacing w:before="0" w:after="0" w:line="240" w:lineRule="auto"/>
             </w:pPr>
             <w:r>
               <w:rPr>
@@ -3122,19 +3246,21 @@
           <w:p>
             <w:pPr>
               <w:rPr/>
-            </w:pPr>
-            <w:r>
-              <w:rPr>
-                <w:rtl w:val="0"/>
-              </w:rPr>
-            </w:r>
-          </w:p>
-        </w:tc>
-        <w:tc>
-          <w:tcPr/>
-          <w:p>
-            <w:pPr>
-              <w:rPr/>
+              <w:spacing w:before="0" w:after="0" w:line="240" w:lineRule="auto"/>
+            </w:pPr>
+            <w:r>
+              <w:rPr>
+                <w:rtl w:val="0"/>
+              </w:rPr>
+            </w:r>
+          </w:p>
+        </w:tc>
+        <w:tc>
+          <w:tcPr/>
+          <w:p>
+            <w:pPr>
+              <w:rPr/>
+              <w:spacing w:before="0" w:after="0" w:line="240" w:lineRule="auto"/>
             </w:pPr>
             <w:r>
               <w:rPr>
@@ -3149,6 +3275,7 @@
           <w:p>
             <w:pPr>
               <w:rPr/>
+              <w:spacing w:before="0" w:after="0" w:line="240" w:lineRule="auto"/>
             </w:pPr>
             <w:r>
               <w:rPr>
@@ -3163,6 +3290,7 @@
           <w:p>
             <w:pPr>
               <w:rPr/>
+              <w:spacing w:before="0" w:after="0" w:line="240" w:lineRule="auto"/>
             </w:pPr>
             <w:r>
               <w:rPr>
@@ -3177,6 +3305,7 @@
           <w:p>
             <w:pPr>
               <w:rPr/>
+              <w:spacing w:before="0" w:after="0" w:line="240" w:lineRule="auto"/>
             </w:pPr>
             <w:r>
               <w:rPr>
@@ -3236,7 +3365,7 @@
           <w:between w:space="0" w:sz="0" w:val="nil"/>
         </w:pBdr>
         <w:shd w:fill="auto" w:val="clear"/>
-        <w:spacing w:after="0" w:before="0" w:line="276" w:lineRule="auto"/>
+        <w:spacing w:after="40" w:before="0" w:line="240" w:lineRule="auto"/>
         <w:ind w:left="360" w:right="0" w:hanging="360"/>
         <w:jc w:val="left"/>
         <w:rPr/>
@@ -3279,7 +3408,7 @@
           <w:between w:space="0" w:sz="0" w:val="nil"/>
         </w:pBdr>
         <w:shd w:fill="auto" w:val="clear"/>
-        <w:spacing w:after="40" w:before="0" w:line="276" w:lineRule="auto"/>
+        <w:spacing w:after="40" w:before="0" w:line="240" w:lineRule="auto"/>
         <w:ind w:left="360" w:right="0" w:hanging="360"/>
         <w:jc w:val="left"/>
         <w:rPr/>
@@ -3341,7 +3470,7 @@
           <w:between w:space="0" w:sz="0" w:val="nil"/>
         </w:pBdr>
         <w:shd w:fill="auto" w:val="clear"/>
-        <w:spacing w:after="0" w:before="0" w:line="276" w:lineRule="auto"/>
+        <w:spacing w:after="40" w:before="0" w:line="240" w:lineRule="auto"/>
         <w:ind w:left="360" w:right="0" w:hanging="360"/>
         <w:jc w:val="left"/>
         <w:rPr/>
@@ -3384,7 +3513,7 @@
           <w:between w:space="0" w:sz="0" w:val="nil"/>
         </w:pBdr>
         <w:shd w:fill="auto" w:val="clear"/>
-        <w:spacing w:after="0" w:before="0" w:line="276" w:lineRule="auto"/>
+        <w:spacing w:after="40" w:before="0" w:line="240" w:lineRule="auto"/>
         <w:ind w:left="360" w:right="0" w:hanging="360"/>
         <w:jc w:val="left"/>
         <w:rPr/>
@@ -3427,7 +3556,7 @@
           <w:between w:space="0" w:sz="0" w:val="nil"/>
         </w:pBdr>
         <w:shd w:fill="auto" w:val="clear"/>
-        <w:spacing w:after="40" w:before="0" w:line="276" w:lineRule="auto"/>
+        <w:spacing w:after="40" w:before="0" w:line="240" w:lineRule="auto"/>
         <w:ind w:left="360" w:right="0" w:hanging="360"/>
         <w:jc w:val="left"/>
         <w:rPr/>
@@ -3843,7 +3972,7 @@
           <w:between w:space="0" w:sz="0" w:val="nil"/>
         </w:pBdr>
         <w:shd w:fill="auto" w:val="clear"/>
-        <w:spacing w:after="0" w:before="0" w:line="276" w:lineRule="auto"/>
+        <w:spacing w:after="40" w:before="0" w:line="240" w:lineRule="auto"/>
         <w:ind w:left="360" w:right="0" w:hanging="360"/>
         <w:jc w:val="left"/>
         <w:rPr/>
@@ -3886,7 +4015,7 @@
           <w:between w:space="0" w:sz="0" w:val="nil"/>
         </w:pBdr>
         <w:shd w:fill="auto" w:val="clear"/>
-        <w:spacing w:after="0" w:before="0" w:line="276" w:lineRule="auto"/>
+        <w:spacing w:after="40" w:before="0" w:line="240" w:lineRule="auto"/>
         <w:ind w:left="360" w:right="0" w:hanging="360"/>
         <w:jc w:val="left"/>
         <w:rPr/>
@@ -3929,7 +4058,7 @@
           <w:between w:space="0" w:sz="0" w:val="nil"/>
         </w:pBdr>
         <w:shd w:fill="auto" w:val="clear"/>
-        <w:spacing w:after="0" w:before="0" w:line="276" w:lineRule="auto"/>
+        <w:spacing w:after="40" w:before="0" w:line="240" w:lineRule="auto"/>
         <w:ind w:left="360" w:right="0" w:hanging="360"/>
         <w:jc w:val="left"/>
         <w:rPr/>
@@ -3972,7 +4101,7 @@
           <w:between w:space="0" w:sz="0" w:val="nil"/>
         </w:pBdr>
         <w:shd w:fill="auto" w:val="clear"/>
-        <w:spacing w:after="40" w:before="0" w:line="276" w:lineRule="auto"/>
+        <w:spacing w:after="40" w:before="0" w:line="240" w:lineRule="auto"/>
         <w:ind w:left="360" w:right="0" w:hanging="360"/>
         <w:jc w:val="left"/>
         <w:rPr/>
@@ -4133,6 +4262,10 @@
             </w:tblBorders>
             <w:tblLayout w:type="fixed"/>
             <w:tblLook w:val="0600"/>
+            <w:tblCellMar>
+              <w:top w:w="40" w:type="dxa"/>
+              <w:bottom w:w="40" w:type="dxa"/>
+            </w:tblCellMar>
           </w:tblPr>
           <w:tblGrid>
             <w:gridCol w:w="2160"/>
@@ -4984,7 +5117,7 @@
           <w:between w:space="0" w:sz="0" w:val="nil"/>
         </w:pBdr>
         <w:shd w:fill="auto" w:val="clear"/>
-        <w:spacing w:after="0" w:before="0" w:line="276" w:lineRule="auto"/>
+        <w:spacing w:after="40" w:before="0" w:line="240" w:lineRule="auto"/>
         <w:ind w:left="360" w:right="0" w:hanging="360"/>
         <w:jc w:val="left"/>
         <w:rPr/>
@@ -5027,7 +5160,7 @@
           <w:between w:space="0" w:sz="0" w:val="nil"/>
         </w:pBdr>
         <w:shd w:fill="auto" w:val="clear"/>
-        <w:spacing w:after="0" w:before="0" w:line="276" w:lineRule="auto"/>
+        <w:spacing w:after="40" w:before="0" w:line="240" w:lineRule="auto"/>
         <w:ind w:left="360" w:right="0" w:hanging="360"/>
         <w:jc w:val="left"/>
         <w:rPr/>
@@ -5070,7 +5203,7 @@
           <w:between w:space="0" w:sz="0" w:val="nil"/>
         </w:pBdr>
         <w:shd w:fill="auto" w:val="clear"/>
-        <w:spacing w:after="40" w:before="0" w:line="276" w:lineRule="auto"/>
+        <w:spacing w:after="40" w:before="0" w:line="240" w:lineRule="auto"/>
         <w:ind w:left="360" w:right="0" w:hanging="360"/>
         <w:jc w:val="left"/>
         <w:rPr/>
@@ -5151,6 +5284,10 @@
         </w:tblBorders>
         <w:tblLayout w:type="fixed"/>
         <w:tblLook w:val="0400"/>
+        <w:tblCellMar>
+          <w:top w:w="40" w:type="dxa"/>
+          <w:bottom w:w="40" w:type="dxa"/>
+        </w:tblCellMar>
       </w:tblPr>
       <w:tblGrid>
         <w:gridCol w:w="1728"/>
@@ -5178,6 +5315,7 @@
           <w:p>
             <w:pPr>
               <w:rPr/>
+              <w:spacing w:before="0" w:after="0" w:line="240" w:lineRule="auto"/>
             </w:pPr>
             <w:r>
               <w:rPr>
@@ -5199,6 +5337,7 @@
           <w:p>
             <w:pPr>
               <w:rPr/>
+              <w:spacing w:before="0" w:after="0" w:line="240" w:lineRule="auto"/>
             </w:pPr>
             <w:r>
               <w:rPr>
@@ -5220,6 +5359,7 @@
           <w:p>
             <w:pPr>
               <w:rPr/>
+              <w:spacing w:before="0" w:after="0" w:line="240" w:lineRule="auto"/>
             </w:pPr>
             <w:r>
               <w:rPr>
@@ -5241,6 +5381,7 @@
           <w:p>
             <w:pPr>
               <w:rPr/>
+              <w:spacing w:before="0" w:after="0" w:line="240" w:lineRule="auto"/>
             </w:pPr>
             <w:r>
               <w:rPr>
@@ -5262,6 +5403,7 @@
           <w:p>
             <w:pPr>
               <w:rPr/>
+              <w:spacing w:before="0" w:after="0" w:line="240" w:lineRule="auto"/>
             </w:pPr>
             <w:r>
               <w:rPr>
@@ -5289,6 +5431,7 @@
           <w:p>
             <w:pPr>
               <w:rPr/>
+              <w:spacing w:before="0" w:after="0" w:line="240" w:lineRule="auto"/>
             </w:pPr>
             <w:r>
               <w:rPr>
@@ -5303,6 +5446,7 @@
           <w:p>
             <w:pPr>
               <w:rPr/>
+              <w:spacing w:before="0" w:after="0" w:line="240" w:lineRule="auto"/>
             </w:pPr>
             <w:r>
               <w:rPr>
@@ -5317,6 +5461,7 @@
           <w:p>
             <w:pPr>
               <w:rPr/>
+              <w:spacing w:before="0" w:after="0" w:line="240" w:lineRule="auto"/>
             </w:pPr>
             <w:r>
               <w:rPr>
@@ -5331,6 +5476,7 @@
           <w:p>
             <w:pPr>
               <w:rPr/>
+              <w:spacing w:before="0" w:after="0" w:line="240" w:lineRule="auto"/>
             </w:pPr>
             <w:r>
               <w:rPr>
@@ -5345,6 +5491,7 @@
           <w:p>
             <w:pPr>
               <w:rPr/>
+              <w:spacing w:before="0" w:after="0" w:line="240" w:lineRule="auto"/>
             </w:pPr>
             <w:r>
               <w:rPr>
@@ -5365,6 +5512,7 @@
           <w:p>
             <w:pPr>
               <w:rPr/>
+              <w:spacing w:before="0" w:after="0" w:line="240" w:lineRule="auto"/>
             </w:pPr>
             <w:r>
               <w:rPr>
@@ -5379,6 +5527,7 @@
           <w:p>
             <w:pPr>
               <w:rPr/>
+              <w:spacing w:before="0" w:after="0" w:line="240" w:lineRule="auto"/>
             </w:pPr>
             <w:r>
               <w:rPr>
@@ -5393,6 +5542,7 @@
           <w:p>
             <w:pPr>
               <w:rPr/>
+              <w:spacing w:before="0" w:after="0" w:line="240" w:lineRule="auto"/>
             </w:pPr>
             <w:r>
               <w:rPr>
@@ -5407,6 +5557,7 @@
           <w:p>
             <w:pPr>
               <w:rPr/>
+              <w:spacing w:before="0" w:after="0" w:line="240" w:lineRule="auto"/>
             </w:pPr>
             <w:r>
               <w:rPr>
@@ -5421,6 +5572,7 @@
           <w:p>
             <w:pPr>
               <w:rPr/>
+              <w:spacing w:before="0" w:after="0" w:line="240" w:lineRule="auto"/>
             </w:pPr>
             <w:r>
               <w:rPr>
@@ -5441,6 +5593,7 @@
           <w:p>
             <w:pPr>
               <w:rPr/>
+              <w:spacing w:before="0" w:after="0" w:line="240" w:lineRule="auto"/>
             </w:pPr>
             <w:r>
               <w:rPr>
@@ -5455,6 +5608,7 @@
           <w:p>
             <w:pPr>
               <w:rPr/>
+              <w:spacing w:before="0" w:after="0" w:line="240" w:lineRule="auto"/>
             </w:pPr>
             <w:r>
               <w:rPr>
@@ -5469,6 +5623,7 @@
           <w:p>
             <w:pPr>
               <w:rPr/>
+              <w:spacing w:before="0" w:after="0" w:line="240" w:lineRule="auto"/>
             </w:pPr>
             <w:r>
               <w:rPr>
@@ -5483,6 +5638,7 @@
           <w:p>
             <w:pPr>
               <w:rPr/>
+              <w:spacing w:before="0" w:after="0" w:line="240" w:lineRule="auto"/>
             </w:pPr>
             <w:r>
               <w:rPr>
@@ -5497,6 +5653,7 @@
           <w:p>
             <w:pPr>
               <w:rPr/>
+              <w:spacing w:before="0" w:after="0" w:line="240" w:lineRule="auto"/>
             </w:pPr>
             <w:r>
               <w:rPr>
@@ -5606,7 +5763,7 @@
           <w:between w:space="0" w:sz="0" w:val="nil"/>
         </w:pBdr>
         <w:shd w:fill="auto" w:val="clear"/>
-        <w:spacing w:after="0" w:before="0" w:line="276" w:lineRule="auto"/>
+        <w:spacing w:after="40" w:before="0" w:line="240" w:lineRule="auto"/>
         <w:ind w:left="360" w:right="0" w:hanging="360"/>
         <w:jc w:val="left"/>
         <w:rPr/>
@@ -5649,7 +5806,7 @@
           <w:between w:space="0" w:sz="0" w:val="nil"/>
         </w:pBdr>
         <w:shd w:fill="auto" w:val="clear"/>
-        <w:spacing w:after="0" w:before="0" w:line="276" w:lineRule="auto"/>
+        <w:spacing w:after="40" w:before="0" w:line="240" w:lineRule="auto"/>
         <w:ind w:left="360" w:right="0" w:hanging="360"/>
         <w:jc w:val="left"/>
         <w:rPr/>
@@ -5692,7 +5849,7 @@
           <w:between w:space="0" w:sz="0" w:val="nil"/>
         </w:pBdr>
         <w:shd w:fill="auto" w:val="clear"/>
-        <w:spacing w:after="40" w:before="0" w:line="276" w:lineRule="auto"/>
+        <w:spacing w:after="40" w:before="0" w:line="240" w:lineRule="auto"/>
         <w:ind w:left="360" w:right="0" w:hanging="360"/>
         <w:jc w:val="left"/>
         <w:rPr/>
@@ -5811,6 +5968,10 @@
         </w:tblBorders>
         <w:tblLayout w:type="fixed"/>
         <w:tblLook w:val="0400"/>
+        <w:tblCellMar>
+          <w:top w:w="40" w:type="dxa"/>
+          <w:bottom w:w="40" w:type="dxa"/>
+        </w:tblCellMar>
       </w:tblPr>
       <w:tblGrid>
         <w:gridCol w:w="2160"/>
@@ -5836,6 +5997,7 @@
           <w:p>
             <w:pPr>
               <w:rPr/>
+              <w:spacing w:before="0" w:after="0" w:line="240" w:lineRule="auto"/>
             </w:pPr>
             <w:r>
               <w:rPr>
@@ -5857,6 +6019,7 @@
           <w:p>
             <w:pPr>
               <w:rPr/>
+              <w:spacing w:before="0" w:after="0" w:line="240" w:lineRule="auto"/>
             </w:pPr>
             <w:r>
               <w:rPr>
@@ -5878,6 +6041,7 @@
           <w:p>
             <w:pPr>
               <w:rPr/>
+              <w:spacing w:before="0" w:after="0" w:line="240" w:lineRule="auto"/>
             </w:pPr>
             <w:r>
               <w:rPr>
@@ -5899,6 +6063,7 @@
           <w:p>
             <w:pPr>
               <w:rPr/>
+              <w:spacing w:before="0" w:after="0" w:line="240" w:lineRule="auto"/>
             </w:pPr>
             <w:r>
               <w:rPr>
@@ -5926,6 +6091,7 @@
           <w:p>
             <w:pPr>
               <w:rPr/>
+              <w:spacing w:before="0" w:after="0" w:line="240" w:lineRule="auto"/>
             </w:pPr>
             <w:r>
               <w:rPr>
@@ -5940,6 +6106,7 @@
           <w:p>
             <w:pPr>
               <w:rPr/>
+              <w:spacing w:before="0" w:after="0" w:line="240" w:lineRule="auto"/>
             </w:pPr>
             <w:r>
               <w:rPr>
@@ -5954,6 +6121,7 @@
           <w:p>
             <w:pPr>
               <w:rPr/>
+              <w:spacing w:before="0" w:after="0" w:line="240" w:lineRule="auto"/>
             </w:pPr>
             <w:r>
               <w:rPr>
@@ -5968,6 +6136,7 @@
           <w:p>
             <w:pPr>
               <w:rPr/>
+              <w:spacing w:before="0" w:after="0" w:line="240" w:lineRule="auto"/>
             </w:pPr>
             <w:r>
               <w:rPr>
@@ -5988,6 +6157,7 @@
           <w:p>
             <w:pPr>
               <w:rPr/>
+              <w:spacing w:before="0" w:after="0" w:line="240" w:lineRule="auto"/>
             </w:pPr>
             <w:r>
               <w:rPr>
@@ -6002,6 +6172,7 @@
           <w:p>
             <w:pPr>
               <w:rPr/>
+              <w:spacing w:before="0" w:after="0" w:line="240" w:lineRule="auto"/>
             </w:pPr>
             <w:r>
               <w:rPr>
@@ -6016,6 +6187,7 @@
           <w:p>
             <w:pPr>
               <w:rPr/>
+              <w:spacing w:before="0" w:after="0" w:line="240" w:lineRule="auto"/>
             </w:pPr>
             <w:r>
               <w:rPr>
@@ -6030,6 +6202,7 @@
           <w:p>
             <w:pPr>
               <w:rPr/>
+              <w:spacing w:before="0" w:after="0" w:line="240" w:lineRule="auto"/>
             </w:pPr>
             <w:r>
               <w:rPr>
@@ -6050,6 +6223,7 @@
           <w:p>
             <w:pPr>
               <w:rPr/>
+              <w:spacing w:before="0" w:after="0" w:line="240" w:lineRule="auto"/>
             </w:pPr>
             <w:r>
               <w:rPr>
@@ -6064,6 +6238,7 @@
           <w:p>
             <w:pPr>
               <w:rPr/>
+              <w:spacing w:before="0" w:after="0" w:line="240" w:lineRule="auto"/>
             </w:pPr>
             <w:r>
               <w:rPr>
@@ -6078,6 +6253,7 @@
           <w:p>
             <w:pPr>
               <w:rPr/>
+              <w:spacing w:before="0" w:after="0" w:line="240" w:lineRule="auto"/>
             </w:pPr>
             <w:r>
               <w:rPr>
@@ -6092,6 +6268,7 @@
           <w:p>
             <w:pPr>
               <w:rPr/>
+              <w:spacing w:before="0" w:after="0" w:line="240" w:lineRule="auto"/>
             </w:pPr>
             <w:r>
               <w:rPr>
@@ -6273,7 +6450,7 @@
     </w:rPrDefault>
     <w:pPrDefault>
       <w:pPr>
-        <w:spacing w:after="200" w:line="276" w:lineRule="auto"/>
+        <w:spacing w:after="80" w:line="240" w:lineRule="auto"/>
       </w:pPr>
     </w:pPrDefault>
   </w:docDefaults>

</xml_diff>